<commit_message>
Tones: replace конопля with кунжут, add neutral-tone example ma (吗)
Update the ma/ma/ma/ma set to кунжут and add the fifth, neutral-tone
example ma 吗 (вопросительная частица) across the tones chart (now five
cards), the exercises minimal-pair line, the animation (fifth frame and
indicator), the cover tag and the Word article.

Co-Authored-By: Claude Opus 4.8 <noreply@anthropic.com>
Claude-Session: https://claude.ai/code/session_01RVXEYDcJcutEhTE5TPkTLr
</commit_message>
<xml_diff>
--- a/content/blog/proiznoshenie-i-tony.DZEN.docx
+++ b/content/blog/proiznoshenie-i-tony.DZEN.docx
@@ -305,7 +305,7 @@
           <w:sz w:val="22"/>
           <w:szCs w:val="22"/>
         </w:rPr>
-        <w:t xml:space="preserve">Классический пример — слог «ma». Произнесённый ровно и высоко (mā) — это 妈 «мама», с восходящей интонацией (má) — 麻 «конопля», с нырком вниз-вверх (mǎ) — 马 «лошадь», а резко вниз (mà) — 骂 «ругать». Один слог, четыре слова. Вот почему без тонов вас могут просто не понять.</w:t>
+        <w:t xml:space="preserve">Классический пример — слог «ma». Произнесённый ровно и высоко (mā) — это 妈 «мама», с восходящей интонацией (má) — 麻 «кунжут», с нырком вниз-вверх (mǎ) — 马 «лошадь», а резко вниз (mà) — 骂 «ругать». А если сказать легко и коротко, без тона (ma), получится вопросительная частица 吗. Один слог — пять смыслов. Вот почему без тонов вас могут просто не понять.</w:t>
       </w:r>
     </w:p>
     <w:p>
@@ -420,7 +420,7 @@
           <w:sz w:val="16"/>
           <w:szCs w:val="16"/>
         </w:rPr>
-        <w:t xml:space="preserve">▲ четыре тона на слоге «ma»</w:t>
+        <w:t xml:space="preserve">▲ один слог «ma» — пять смыслов</w:t>
       </w:r>
     </w:p>
     <w:p>
@@ -594,7 +594,7 @@
           <w:sz w:val="22"/>
           <w:szCs w:val="22"/>
         </w:rPr>
-        <w:t xml:space="preserve"> — включите запись носителя (минимальные пары mā/má/mǎ/mà) и тут же повторяйте вслух. Ухо учится различать быстрее, чем кажется.</w:t>
+        <w:t xml:space="preserve"> — включите запись носителя (минимальные пары mā/má/mǎ/mà/ma) и тут же повторяйте вслух. Ухо учится различать быстрее, чем кажется.</w:t>
       </w:r>
     </w:p>
     <w:p>

</xml_diff>